<commit_message>
fix: add space to vmerge cells for label display
</commit_message>
<xml_diff>
--- a/华南农业大学2026年动科-海洋-兽医三院联合水_改好.docx
+++ b/华南农业大学2026年动科-海洋-兽医三院联合水_改好.docx
@@ -321,6 +321,11 @@
               <w:jc w:val="center"/>
             </w:pPr>
           </w:p>
+          <w:p>
+            <w:r>
+              <w:t xml:space="preserve"> </w:t>
+            </w:r>
+          </w:p>
         </w:tc>
         <w:tc>
           <w:tcPr/>
@@ -464,6 +469,11 @@
               <w:jc w:val="center"/>
             </w:pPr>
           </w:p>
+          <w:p>
+            <w:r>
+              <w:t xml:space="preserve"> </w:t>
+            </w:r>
+          </w:p>
         </w:tc>
         <w:tc>
           <w:tcPr>
@@ -513,6 +523,11 @@
               <w:jc w:val="center"/>
             </w:pPr>
           </w:p>
+          <w:p>
+            <w:r>
+              <w:t xml:space="preserve"> </w:t>
+            </w:r>
+          </w:p>
         </w:tc>
         <w:tc>
           <w:tcPr/>
@@ -656,6 +671,11 @@
               <w:jc w:val="center"/>
             </w:pPr>
           </w:p>
+          <w:p>
+            <w:r>
+              <w:t xml:space="preserve"> </w:t>
+            </w:r>
+          </w:p>
         </w:tc>
         <w:tc>
           <w:tcPr>
@@ -705,6 +725,11 @@
               <w:jc w:val="center"/>
             </w:pPr>
           </w:p>
+          <w:p>
+            <w:r>
+              <w:t xml:space="preserve"> </w:t>
+            </w:r>
+          </w:p>
         </w:tc>
         <w:tc>
           <w:tcPr/>
@@ -824,6 +849,11 @@
               <w:jc w:val="center"/>
             </w:pPr>
           </w:p>
+          <w:p>
+            <w:r>
+              <w:t xml:space="preserve"> </w:t>
+            </w:r>
+          </w:p>
         </w:tc>
         <w:tc>
           <w:tcPr>
@@ -873,6 +903,11 @@
               <w:jc w:val="center"/>
             </w:pPr>
           </w:p>
+          <w:p>
+            <w:r>
+              <w:t xml:space="preserve"> </w:t>
+            </w:r>
+          </w:p>
         </w:tc>
         <w:tc>
           <w:tcPr/>
@@ -976,6 +1011,11 @@
               <w:jc w:val="center"/>
             </w:pPr>
           </w:p>
+          <w:p>
+            <w:r>
+              <w:t xml:space="preserve"> </w:t>
+            </w:r>
+          </w:p>
         </w:tc>
         <w:tc>
           <w:tcPr>
@@ -1025,6 +1065,11 @@
               <w:jc w:val="center"/>
             </w:pPr>
           </w:p>
+          <w:p>
+            <w:r>
+              <w:t xml:space="preserve"> </w:t>
+            </w:r>
+          </w:p>
         </w:tc>
         <w:tc>
           <w:tcPr/>
@@ -1176,6 +1221,11 @@
               <w:jc w:val="center"/>
             </w:pPr>
           </w:p>
+          <w:p>
+            <w:r>
+              <w:t xml:space="preserve"> </w:t>
+            </w:r>
+          </w:p>
         </w:tc>
         <w:tc>
           <w:tcPr>
@@ -1225,6 +1275,11 @@
               <w:jc w:val="center"/>
             </w:pPr>
           </w:p>
+          <w:p>
+            <w:r>
+              <w:t xml:space="preserve"> </w:t>
+            </w:r>
+          </w:p>
         </w:tc>
         <w:tc>
           <w:tcPr/>
@@ -1344,6 +1399,11 @@
               <w:jc w:val="center"/>
             </w:pPr>
           </w:p>
+          <w:p>
+            <w:r>
+              <w:t xml:space="preserve"> </w:t>
+            </w:r>
+          </w:p>
         </w:tc>
         <w:tc>
           <w:tcPr>
@@ -1393,6 +1453,11 @@
               <w:jc w:val="center"/>
             </w:pPr>
           </w:p>
+          <w:p>
+            <w:r>
+              <w:t xml:space="preserve"> </w:t>
+            </w:r>
+          </w:p>
         </w:tc>
         <w:tc>
           <w:tcPr/>
@@ -1496,6 +1561,11 @@
               <w:jc w:val="center"/>
             </w:pPr>
           </w:p>
+          <w:p>
+            <w:r>
+              <w:t xml:space="preserve"> </w:t>
+            </w:r>
+          </w:p>
         </w:tc>
         <w:tc>
           <w:tcPr>
@@ -1545,6 +1615,11 @@
               <w:jc w:val="center"/>
             </w:pPr>
           </w:p>
+          <w:p>
+            <w:r>
+              <w:t xml:space="preserve"> </w:t>
+            </w:r>
+          </w:p>
         </w:tc>
         <w:tc>
           <w:tcPr/>
@@ -1706,6 +1781,11 @@
               <w:jc w:val="center"/>
             </w:pPr>
           </w:p>
+          <w:p>
+            <w:r>
+              <w:t xml:space="preserve"> </w:t>
+            </w:r>
+          </w:p>
         </w:tc>
         <w:tc>
           <w:tcPr/>
@@ -1849,6 +1929,11 @@
               <w:jc w:val="center"/>
             </w:pPr>
           </w:p>
+          <w:p>
+            <w:r>
+              <w:t xml:space="preserve"> </w:t>
+            </w:r>
+          </w:p>
         </w:tc>
         <w:tc>
           <w:tcPr/>
@@ -1992,6 +2077,11 @@
               <w:jc w:val="center"/>
             </w:pPr>
           </w:p>
+          <w:p>
+            <w:r>
+              <w:t xml:space="preserve"> </w:t>
+            </w:r>
+          </w:p>
         </w:tc>
         <w:tc>
           <w:tcPr>
@@ -2041,6 +2131,11 @@
               <w:jc w:val="center"/>
             </w:pPr>
           </w:p>
+          <w:p>
+            <w:r>
+              <w:t xml:space="preserve"> </w:t>
+            </w:r>
+          </w:p>
         </w:tc>
         <w:tc>
           <w:tcPr/>
@@ -2184,6 +2279,11 @@
               <w:jc w:val="center"/>
             </w:pPr>
           </w:p>
+          <w:p>
+            <w:r>
+              <w:t xml:space="preserve"> </w:t>
+            </w:r>
+          </w:p>
         </w:tc>
         <w:tc>
           <w:tcPr/>
@@ -2327,6 +2427,11 @@
               <w:jc w:val="center"/>
             </w:pPr>
           </w:p>
+          <w:p>
+            <w:r>
+              <w:t xml:space="preserve"> </w:t>
+            </w:r>
+          </w:p>
         </w:tc>
         <w:tc>
           <w:tcPr>
@@ -2376,6 +2481,11 @@
               <w:jc w:val="center"/>
             </w:pPr>
           </w:p>
+          <w:p>
+            <w:r>
+              <w:t xml:space="preserve"> </w:t>
+            </w:r>
+          </w:p>
         </w:tc>
         <w:tc>
           <w:tcPr/>
@@ -2519,6 +2629,11 @@
               <w:jc w:val="center"/>
             </w:pPr>
           </w:p>
+          <w:p>
+            <w:r>
+              <w:t xml:space="preserve"> </w:t>
+            </w:r>
+          </w:p>
         </w:tc>
         <w:tc>
           <w:tcPr>
@@ -2568,6 +2683,11 @@
               <w:jc w:val="center"/>
             </w:pPr>
           </w:p>
+          <w:p>
+            <w:r>
+              <w:t xml:space="preserve"> </w:t>
+            </w:r>
+          </w:p>
         </w:tc>
         <w:tc>
           <w:tcPr/>
@@ -2679,6 +2799,11 @@
               <w:jc w:val="center"/>
             </w:pPr>
           </w:p>
+          <w:p>
+            <w:r>
+              <w:t xml:space="preserve"> </w:t>
+            </w:r>
+          </w:p>
         </w:tc>
         <w:tc>
           <w:tcPr>
@@ -2728,6 +2853,11 @@
               <w:jc w:val="center"/>
             </w:pPr>
           </w:p>
+          <w:p>
+            <w:r>
+              <w:t xml:space="preserve"> </w:t>
+            </w:r>
+          </w:p>
         </w:tc>
         <w:tc>
           <w:tcPr/>
@@ -2871,6 +3001,11 @@
               <w:jc w:val="center"/>
             </w:pPr>
           </w:p>
+          <w:p>
+            <w:r>
+              <w:t xml:space="preserve"> </w:t>
+            </w:r>
+          </w:p>
         </w:tc>
         <w:tc>
           <w:tcPr/>
@@ -3014,6 +3149,11 @@
               <w:jc w:val="center"/>
             </w:pPr>
           </w:p>
+          <w:p>
+            <w:r>
+              <w:t xml:space="preserve"> </w:t>
+            </w:r>
+          </w:p>
         </w:tc>
         <w:tc>
           <w:tcPr/>
@@ -3125,6 +3265,11 @@
               <w:jc w:val="center"/>
             </w:pPr>
           </w:p>
+          <w:p>
+            <w:r>
+              <w:t xml:space="preserve"> </w:t>
+            </w:r>
+          </w:p>
         </w:tc>
         <w:tc>
           <w:tcPr>
@@ -3174,6 +3319,11 @@
               <w:jc w:val="center"/>
             </w:pPr>
           </w:p>
+          <w:p>
+            <w:r>
+              <w:t xml:space="preserve"> </w:t>
+            </w:r>
+          </w:p>
         </w:tc>
         <w:tc>
           <w:tcPr/>
@@ -3317,6 +3467,11 @@
               <w:jc w:val="center"/>
             </w:pPr>
           </w:p>
+          <w:p>
+            <w:r>
+              <w:t xml:space="preserve"> </w:t>
+            </w:r>
+          </w:p>
         </w:tc>
         <w:tc>
           <w:tcPr>
@@ -3366,6 +3521,11 @@
               <w:jc w:val="center"/>
             </w:pPr>
           </w:p>
+          <w:p>
+            <w:r>
+              <w:t xml:space="preserve"> </w:t>
+            </w:r>
+          </w:p>
         </w:tc>
         <w:tc>
           <w:tcPr/>
@@ -3477,6 +3637,11 @@
               <w:jc w:val="center"/>
             </w:pPr>
           </w:p>
+          <w:p>
+            <w:r>
+              <w:t xml:space="preserve"> </w:t>
+            </w:r>
+          </w:p>
         </w:tc>
         <w:tc>
           <w:tcPr>
@@ -3525,6 +3690,11 @@
             <w:pPr>
               <w:jc w:val="center"/>
             </w:pPr>
+          </w:p>
+          <w:p>
+            <w:r>
+              <w:t xml:space="preserve"> </w:t>
+            </w:r>
           </w:p>
         </w:tc>
         <w:tc>

</xml_diff>